<commit_message>
chore: archive old scripts and remove old commands
- Move generate_resume.py → archive/generate_resume_old.py
- Move generate_cover_letter.py → archive/generate_cover_letter_old.py
- Delete resume_create.md command
- Delete cover_letter_create.md command

Co-Authored-By: Claude Opus 4.5 <noreply@anthropic.com>
</commit_message>
<xml_diff>
--- a/jobs/Macquarie_Commodities_Global_Markets_Graduate_13-10-2025/Resume_Adrian_Turion.docx
+++ b/jobs/Macquarie_Commodities_Global_Markets_Graduate_13-10-2025/Resume_Adrian_Turion.docx
@@ -438,7 +438,7 @@
                 <w:rFonts w:ascii="Times New Roman" w:hAnsi="Times New Roman"/>
                 <w:sz w:val="20"/>
               </w:rPr>
-              <w:t>Finance graduate with hands-on transaction exposure across healthcare, technology, and life sciences sectors. Demonstrated innate curiosity through entrepreneurial ventures and cross-functional projects spanning M&amp;A, FP&amp;A, and technical innovation. Proven ability to work on transactions from day one, developing technical skills and business knowledge in dynamic team environments. Eager to bring analytical mindset and eagerness to learn to Macquarie's Commodities and Global Markets Graduate Programme.</w:t>
+              <w:t>Finance graduate with hands-on transaction exposure across healthcare, technology, and life sciences sectors. Demonstrated innate curiosity through entrepreneurial ventures and cross-functional projects spanning M&amp;A, FP&amp;A, and technical innovation. Eager to bring analytical mindset and eagerness to learn to Macquarie's Commodities and Global Markets Graduate Programme.</w:t>
             </w:r>
           </w:p>
         </w:tc>
@@ -794,18 +794,6 @@
               </w:rPr>
               <w:t>Staffed on 7 live mandates (sell-side, buy-side, debt advisory) across healthcare, tech, and life sciences sectors with deal values ranging from EUR 5M to EUR 50M, working on transactions from day one in a lean 3-person team</w:t>
             </w:r>
-            <w:r>
-              <w:rPr>
-                <w:rFonts w:ascii="Times New Roman" w:hAnsi="Times New Roman"/>
-                <w:sz w:val="20"/>
-              </w:rPr>
-            </w:r>
-            <w:r>
-              <w:rPr>
-                <w:rFonts w:ascii="Times New Roman" w:hAnsi="Times New Roman"/>
-                <w:sz w:val="20"/>
-              </w:rPr>
-            </w:r>
           </w:p>
           <w:p>
             <w:pPr>
@@ -829,18 +817,6 @@
               </w:rPr>
               <w:t>Built detailed financial models (LBO, DCF, trading comps, precedent transactions) and prepared client presentations for Board meetings and investor pitches, developing technical skills through hands-on deal execution</w:t>
             </w:r>
-            <w:r>
-              <w:rPr>
-                <w:rFonts w:ascii="Times New Roman" w:hAnsi="Times New Roman"/>
-                <w:sz w:val="20"/>
-              </w:rPr>
-            </w:r>
-            <w:r>
-              <w:rPr>
-                <w:rFonts w:ascii="Times New Roman" w:hAnsi="Times New Roman"/>
-                <w:sz w:val="20"/>
-              </w:rPr>
-            </w:r>
           </w:p>
           <w:p>
             <w:pPr>
@@ -863,18 +839,6 @@
                 <w:sz w:val="20"/>
               </w:rPr>
               <w:t>End-to-end execution exposure in a dynamic deal team managing sourcing, valuation, due diligence, negotiations, and closing, demonstrating innate curiosity across diverse sectors and transaction types</w:t>
-            </w:r>
-            <w:r>
-              <w:rPr>
-                <w:rFonts w:ascii="Times New Roman" w:hAnsi="Times New Roman"/>
-                <w:sz w:val="20"/>
-              </w:rPr>
-            </w:r>
-            <w:r>
-              <w:rPr>
-                <w:rFonts w:ascii="Times New Roman" w:hAnsi="Times New Roman"/>
-                <w:sz w:val="20"/>
-              </w:rPr>
             </w:r>
           </w:p>
           <w:p>
@@ -1098,19 +1062,7 @@
                 <w:rFonts w:ascii="Times New Roman" w:hAnsi="Times New Roman"/>
                 <w:sz w:val="20"/>
               </w:rPr>
-              <w:t>Worked directly with CEO of Healthcare and Retail divisions on evaluating multiple acquisition targets in France and Belgium, preparing investment memos with market analysis, competitive positioning, and financial projections for 3 potential acquisitions (EUR 10M-30M targets)</w:t>
-            </w:r>
-            <w:r>
-              <w:rPr>
-                <w:rFonts w:ascii="Times New Roman" w:hAnsi="Times New Roman"/>
-                <w:sz w:val="20"/>
-              </w:rPr>
-            </w:r>
-            <w:r>
-              <w:rPr>
-                <w:rFonts w:ascii="Times New Roman" w:hAnsi="Times New Roman"/>
-                <w:sz w:val="20"/>
-              </w:rPr>
+              <w:t>Worked directly with CEO of Healthcare and Retail divisions on evaluating multiple acquisition targets in France and Belgium, preparing investment memos with market analysis and financial projections for 3 potential acquisitions (EUR 10M-30M targets)</w:t>
             </w:r>
           </w:p>
           <w:p>
@@ -1322,18 +1274,6 @@
                 <w:sz w:val="20"/>
               </w:rPr>
               <w:t>Built automated financial dashboards in Excel and PowerBI for CHF 50M+ subsidiary, performed variance analysis on monthly P&amp;L results, and prepared Board presentations on financial performance, developing technical skills critical for business knowledge</w:t>
-            </w:r>
-            <w:r>
-              <w:rPr>
-                <w:rFonts w:ascii="Times New Roman" w:hAnsi="Times New Roman"/>
-                <w:sz w:val="20"/>
-              </w:rPr>
-            </w:r>
-            <w:r>
-              <w:rPr>
-                <w:rFonts w:ascii="Times New Roman" w:hAnsi="Times New Roman"/>
-                <w:sz w:val="20"/>
-              </w:rPr>
             </w:r>
           </w:p>
           <w:p>
@@ -1418,19 +1358,7 @@
                 <w:rFonts w:ascii="Times New Roman" w:hAnsi="Times New Roman"/>
                 <w:sz w:val="20"/>
               </w:rPr>
-              <w:t>Founded and developed Screeny.ai, an AI-driven buyer sourcing tool for investment banks, leading full-stack development and sales outreach; tool adopted by 3 firms, reducing buyer research time by ~90% (10h+ to 20min), demonstrating innovative approach to challenging the status quo</w:t>
-            </w:r>
-            <w:r>
-              <w:rPr>
-                <w:rFonts w:ascii="Times New Roman" w:hAnsi="Times New Roman"/>
-                <w:sz w:val="20"/>
-              </w:rPr>
-            </w:r>
-            <w:r>
-              <w:rPr>
-                <w:rFonts w:ascii="Times New Roman" w:hAnsi="Times New Roman"/>
-                <w:sz w:val="20"/>
-              </w:rPr>
+              <w:t>Founded and developed Screeny.ai, an AI-driven buyer sourcing tool for investment banks, leading full-stack development and sales outreach; tool adopted by 3 firms, reducing buyer research time by ~90% (10h+ to 20min)</w:t>
             </w:r>
           </w:p>
           <w:p>
@@ -1455,18 +1383,6 @@
               </w:rPr>
               <w:t>Finalist in 2024 McKinsey &amp; Company Business Case, presenting data-driven predictive model to executives; showcased analytical thinking and innate curiosity in problem-solving with potential CHF 200K revenue impact</w:t>
             </w:r>
-            <w:r>
-              <w:rPr>
-                <w:rFonts w:ascii="Times New Roman" w:hAnsi="Times New Roman"/>
-                <w:sz w:val="20"/>
-              </w:rPr>
-            </w:r>
-            <w:r>
-              <w:rPr>
-                <w:rFonts w:ascii="Times New Roman" w:hAnsi="Times New Roman"/>
-                <w:sz w:val="20"/>
-              </w:rPr>
-            </w:r>
           </w:p>
           <w:p>
             <w:pPr>
@@ -1489,18 +1405,6 @@
                 <w:sz w:val="20"/>
               </w:rPr>
               <w:t>Led post-COVID financial recovery for AIESEC by sourcing corporate leads and negotiating partnerships; closed 3 deals generating CHF 60K annual revenue through resilience and collaborative teamwork</w:t>
-            </w:r>
-            <w:r>
-              <w:rPr>
-                <w:rFonts w:ascii="Times New Roman" w:hAnsi="Times New Roman"/>
-                <w:sz w:val="20"/>
-              </w:rPr>
-            </w:r>
-            <w:r>
-              <w:rPr>
-                <w:rFonts w:ascii="Times New Roman" w:hAnsi="Times New Roman"/>
-                <w:sz w:val="20"/>
-              </w:rPr>
             </w:r>
           </w:p>
         </w:tc>
@@ -1799,13 +1703,7 @@
                 <w:sz w:val="20"/>
                 <w:szCs w:val="20"/>
               </w:rPr>
-              <w:t>Relevant Coursework: Derivatives, Fixed Income and Credit Risk, Data Science for Finance, Quantitative Asset and Risk Management</w:t>
-            </w:r>
-            <w:r>
-              <w:rPr>
-                <w:rFonts w:ascii="Times New Roman" w:hAnsi="Times New Roman"/>
-                <w:sz w:val="20"/>
-              </w:rPr>
+              <w:t>Relevant Coursework: Derivatives, Fixed Income and Credit Risk, Data Science for Finance, Quantitative Asset Management</w:t>
             </w:r>
           </w:p>
           <w:p>
@@ -2613,6 +2511,7 @@
         </w:tc>
       </w:tr>
     </w:tbl>
+    <w:p/>
     <w:sectPr>
       <w:headerReference w:type="even" r:id="rId9"/>
       <w:headerReference w:type="default" r:id="rId10"/>

</xml_diff>